<commit_message>
Update clinic name to 整痛メディカルクリニック and revise purpose draft
Co-Authored-By: Claude Opus 5.5 <noreply@anthropic.com>
Claude-Session: https://claude.ai/code/session_01UiFviJw7reCyPmVQF98KKP
</commit_message>
<xml_diff>
--- a/output/一般社団法人設立_福十字_記入案.docx
+++ b/output/一般社団法人設立_福十字_記入案.docx
@@ -303,11 +303,12 @@
                 <w:rFonts w:hint="eastAsia"/>
                 <w:b/>
               </w:rPr>
-              <w:t xml:space="preserve">福十字の整痛クリニック（第一候補）</w:t>
-            </w:r>
-          </w:p>
-          <w:p>
-            <w:pPr>
+              <w:t xml:space="preserve">整痛メディカルクリニック（せいつうめでぃかるくりにっく）</w:t>
+            </w:r>
+          </w:p>
+          <w:p>
+            <w:pPr>
+              <w:ind w:left="210" w:hangingChars="100" w:hanging="210"/>
               <w:rPr>
                 <w:rFonts w:hint="eastAsia"/>
                 <w:sz w:val="18"/>
@@ -320,11 +321,12 @@
                 <w:sz w:val="18"/>
                 <w:szCs w:val="18"/>
               </w:rPr>
-              <w:t xml:space="preserve">【その他候補】</w:t>
-            </w:r>
-          </w:p>
-          <w:p>
-            <w:pPr>
+              <w:t xml:space="preserve">※由来：痛みを「整える」医療（整痛）を医療機関として提供（メディカル）</w:t>
+            </w:r>
+          </w:p>
+          <w:p>
+            <w:pPr>
+              <w:ind w:left="210" w:hangingChars="100" w:hanging="210"/>
               <w:rPr>
                 <w:rFonts w:hint="eastAsia"/>
                 <w:sz w:val="18"/>
@@ -337,7 +339,7 @@
                 <w:sz w:val="18"/>
                 <w:szCs w:val="18"/>
               </w:rPr>
-              <w:t xml:space="preserve">② 福十字整痛ケアクリニック　③ 福十字整痛診療所</w:t>
+              <w:t xml:space="preserve">※字画：総画数52（新字体・旧字体とも同じ）　吉数</w:t>
             </w:r>
           </w:p>
           <w:p>
@@ -355,25 +357,7 @@
                 <w:sz w:val="18"/>
                 <w:szCs w:val="18"/>
               </w:rPr>
-              <w:t xml:space="preserve">※「福十字」を冠することで、既存の「整痛」単独の名称と区別します。</w:t>
-            </w:r>
-          </w:p>
-          <w:p>
-            <w:pPr>
-              <w:ind w:left="210" w:hangingChars="100" w:hanging="210"/>
-              <w:rPr>
-                <w:rFonts w:hint="eastAsia"/>
-                <w:sz w:val="18"/>
-                <w:szCs w:val="18"/>
-              </w:rPr>
-            </w:pPr>
-            <w:r>
-              <w:rPr>
-                <w:rFonts w:hint="eastAsia"/>
-                <w:sz w:val="18"/>
-                <w:szCs w:val="18"/>
-              </w:rPr>
-              <w:t xml:space="preserve">※字画（新字体の総画数）：①61　②65　③86（＝6）　いずれも吉数</w:t>
+              <w:t xml:space="preserve">※「整痛」の使用はふっか様との関係をご確認ください。</w:t>
             </w:r>
           </w:p>
         </w:tc>
@@ -1734,20 +1718,7 @@
               <w:rPr>
                 <w:rFonts w:hint="eastAsia"/>
               </w:rPr>
-              <w:t xml:space="preserve">当法人は、首・肩・腰・膝などの慢性的な痛みやしびれに悩む地域の方々に対し、痛みの原因を多角的に評価したうえで、薬物療法、リハビリテーション及び生活指導等を組み合わせた「痛みを整える」医療を提供し、患者一人ひとりが痛みに妨げられることなく自分らしい日常生活を送れるよう支援することにより、地域住民の健康の維持増進及び地域医療の発展に寄与することを目的とし、その目的に資するため次の事業を行う。</w:t>
-            </w:r>
-          </w:p>
-          <w:p>
-            <w:pPr>
-              <w:rPr>
-                <w:rFonts w:hint="eastAsia"/>
-              </w:rPr>
-            </w:pPr>
-            <w:r>
-              <w:rPr>
-                <w:rFonts w:hint="eastAsia"/>
-              </w:rPr>
-              <w:t xml:space="preserve"/>
+              <w:t xml:space="preserve">当法人は、整痛メディカルクリニックの開設及び運営を通じて、首・肩・腰・膝などの慢性的な痛みやしびれに悩む地域の方々に対し、痛みの原因を多角的に評価したうえで、薬物療法、リハビリテーション及び生活指導等を組み合わせた「痛みを整える」医療を提供し、患者一人ひとりが痛みに妨げられることなく自分らしい日常生活を送れるよう支援することにより、地域住民の健康の維持増進及び地域医療の発展に寄与することを目的とし、その目的に資するため次の事業を行う。</w:t>
             </w:r>
           </w:p>
           <w:p>
@@ -1783,7 +1754,7 @@
                 <w:sz w:val="18"/>
                 <w:szCs w:val="18"/>
               </w:rPr>
-              <w:t xml:space="preserve">・痛みを「整える」　…その場しのぎではなく、原因からのアプローチ</w:t>
+              <w:t xml:space="preserve">・整痛（痛みを「整える」）　…その場しのぎではなく、原因からのアプローチ</w:t>
             </w:r>
           </w:p>
           <w:p>
@@ -1835,6 +1806,23 @@
                 <w:szCs w:val="18"/>
               </w:rPr>
               <w:t xml:space="preserve">・地域のかかりつけ／医師とリハビリ職の連携によるチーム医療</w:t>
+            </w:r>
+          </w:p>
+          <w:p>
+            <w:pPr>
+              <w:rPr>
+                <w:rFonts w:hint="eastAsia"/>
+                <w:sz w:val="18"/>
+                <w:szCs w:val="18"/>
+              </w:rPr>
+            </w:pPr>
+            <w:r>
+              <w:rPr>
+                <w:rFonts w:hint="eastAsia"/>
+                <w:sz w:val="18"/>
+                <w:szCs w:val="18"/>
+              </w:rPr>
+              <w:t xml:space="preserve">・メディカル　…医師による診断に基づく、安心・安全な医療の提供</w:t>
             </w:r>
           </w:p>
         </w:tc>

</xml_diff>